<commit_message>
fix(docs): clean LaTeX math formatting and re-export beautiful Word documents
</commit_message>
<xml_diff>
--- a/reports/REPORT.docx
+++ b/reports/REPORT.docx
@@ -234,7 +234,7 @@
         <w:t>Strict Compliance with Twitter Constraints</w:t>
       </w:r>
       <w:r>
-        <w:t>: Output length must be $\le 280$ characters, empathetic, succinct, and provide verified self-service URL destinations.</w:t>
+        <w:t>: Output length must be ≤ 280 characters, empathetic, succinct, and provide verified self-service URL destinations.</w:t>
       </w:r>
     </w:p>
     <w:p>
@@ -410,7 +410,7 @@
         <w:t>ACCOUNT_ACCESS_SECURITY</w:t>
       </w:r>
       <w:r>
-        <w:t xml:space="preserve"> $\rightarrow$ +0.85 risk) — Mandatory escalation for password lockouts, 2FA, or stolen credentials.</w:t>
+        <w:t xml:space="preserve"> → +0.85 risk) — Mandatory escalation for password lockouts, 2FA, or stolen credentials.</w:t>
       </w:r>
     </w:p>
     <w:p>
@@ -480,7 +480,7 @@
         <w:t>police</w:t>
       </w:r>
       <w:r>
-        <w:t xml:space="preserve"> $\rightarrow$ +0.90 risk) — Immediate route to Executive Escalations.</w:t>
+        <w:t xml:space="preserve"> → +0.90 risk) — Immediate route to Executive Escalations.</w:t>
       </w:r>
     </w:p>
     <w:p>
@@ -528,7 +528,7 @@
         <w:t>still waiting</w:t>
       </w:r>
       <w:r>
-        <w:t xml:space="preserve"> $\rightarrow$ +0.75 risk) — Churn avoidance when previous automated paths failed.</w:t>
+        <w:t xml:space="preserve"> → +0.75 risk) — Churn avoidance when previous automated paths failed.</w:t>
       </w:r>
     </w:p>
     <w:p>
@@ -565,7 +565,7 @@
         <w:t>look into my order</w:t>
       </w:r>
       <w:r>
-        <w:t xml:space="preserve"> $\rightarrow$ +0.70 risk) — Public social media cannot expose private records.</w:t>
+        <w:t xml:space="preserve"> → +0.70 risk) — Public social media cannot expose private records.</w:t>
       </w:r>
     </w:p>
     <w:p>
@@ -624,7 +624,7 @@
         <w:t>disgusted</w:t>
       </w:r>
       <w:r>
-        <w:t xml:space="preserve"> $\rightarrow$ +0.60 risk) — De-escalates angry customers to empathetic human specialists.</w:t>
+        <w:t xml:space="preserve"> → +0.60 risk) — De-escalates angry customers to empathetic human specialists.</w:t>
       </w:r>
     </w:p>
     <w:p>
@@ -639,7 +639,7 @@
         <w:t>Signal 6: Model Uncertainty Gate</w:t>
       </w:r>
       <w:r>
-        <w:t xml:space="preserve"> ($\text{confidence} &lt; 0.70 \rightarrow +0.50$ risk) — Safe fallback on ambiguous or out-of-distribution queries.</w:t>
+        <w:t xml:space="preserve"> (confidence &lt; 0.70 → +0.50 risk) — Safe fallback on ambiguous or out-of-distribution queries.</w:t>
       </w:r>
     </w:p>
     <w:p>
@@ -671,7 +671,7 @@
         <w:t>AUTO_HANDLE</w:t>
       </w:r>
       <w:r>
-        <w:t xml:space="preserve"> ($\text{risk} &lt; 0.65$): Dispatches an authentic </w:t>
+        <w:t xml:space="preserve"> (risk &lt; 0.65): Dispatches an authentic </w:t>
       </w:r>
       <w:r>
         <w:rPr>
@@ -682,7 +682,7 @@
         <w:t>@AmazonHelp</w:t>
       </w:r>
       <w:r>
-        <w:t xml:space="preserve"> SOP self-service reply with official verified links within $\le 280$ characters. Stated reason: </w:t>
+        <w:t xml:space="preserve"> SOP self-service reply with official verified links within ≤ 280 characters. Stated reason: </w:t>
       </w:r>
       <w:r>
         <w:rPr>
@@ -705,7 +705,7 @@
         <w:t>ESCALATE_TO_HUMAN</w:t>
       </w:r>
       <w:r>
-        <w:t xml:space="preserve"> ($\text{risk} \ge 0.65$): Dispatches a safe de-escalation holding reply while passing an internal triage payload to human supervisors with an explicit diagnostic </w:t>
+        <w:t xml:space="preserve"> (risk ≥ 0.65): Dispatches a safe de-escalation holding reply while passing an internal triage payload to human supervisors with an explicit diagnostic </w:t>
       </w:r>
       <w:r>
         <w:rPr>
@@ -1912,25 +1912,7 @@
         <w:t>Hypothesis &amp; Root Cause</w:t>
       </w:r>
       <w:r>
-        <w:t>: Single-label classification architectures struggle when a customer experiences a sequence of failures (hardware defect $</w:t>
-      </w:r>
-    </w:p>
-    <w:p>
-      <w:pPr>
-        <w:spacing w:after="100" w:before="0" w:line="276" w:lineRule="auto"/>
-        <w:jc w:val="left"/>
-      </w:pPr>
-      <w:r>
-        <w:t>ightarrow$ label failure $</w:t>
-      </w:r>
-    </w:p>
-    <w:p>
-      <w:pPr>
-        <w:spacing w:after="100" w:before="0" w:line="276" w:lineRule="auto"/>
-        <w:jc w:val="left"/>
-      </w:pPr>
-      <w:r>
-        <w:t>ightarrow$ refund request).</w:t>
+        <w:t>: Single-label classification architectures struggle when a customer experiences a sequence of failures (hardware defect → label failure → refund request).</w:t>
       </w:r>
     </w:p>
     <w:p>
@@ -2852,7 +2834,7 @@
               <w:rPr>
                 <w:sz w:val="19"/>
               </w:rPr>
-              <w:t>LoRA (Rank $r=16$, $\alpha=32$, Dropout $0.05$)</w:t>
+              <w:t>LoRA (Rank r=16, α=32, Dropout 0.05)</w:t>
             </w:r>
           </w:p>
         </w:tc>
@@ -3275,7 +3257,7 @@
               <w:rPr>
                 <w:sz w:val="19"/>
               </w:rPr>
-              <w:t>3 Full Epochs (1,875 optimization steps), Cosine LR Decay ($2\times 10^{-4}$)</w:t>
+              <w:t>3 Full Epochs (1,875 optimization steps), Cosine LR Decay (2 × 10⁻⁴)</w:t>
             </w:r>
           </w:p>
         </w:tc>
@@ -3354,7 +3336,7 @@
               <w:rPr>
                 <w:sz w:val="19"/>
               </w:rPr>
-              <w:t xml:space="preserve">Initial loss &gt;10.0 $\rightarrow$ </w:t>
+              <w:t xml:space="preserve">Initial loss &gt;10.0 → </w:t>
             </w:r>
             <w:r>
               <w:rPr>
@@ -3796,7 +3778,7 @@
               <w:rPr>
                 <w:sz w:val="19"/>
               </w:rPr>
-              <w:t xml:space="preserve"> ($\le 280$)</w:t>
+              <w:t xml:space="preserve"> (≤ 280)</w:t>
             </w:r>
           </w:p>
         </w:tc>
@@ -3872,7 +3854,7 @@
                 <w:i/>
                 <w:sz w:val="19"/>
               </w:rPr>
-              <w:t>"My credit card was charged $139 for Prime renewal but I cancelled 2 weeks ago!"</w:t>
+              <w:t>"My credit card was charged 139 for Prime renewal but I cancelled 2 weeks ago!"</w:t>
             </w:r>
           </w:p>
         </w:tc>
@@ -3997,7 +3979,7 @@
               <w:rPr>
                 <w:sz w:val="19"/>
               </w:rPr>
-              <w:t xml:space="preserve"> ($\le 280$)</w:t>
+              <w:t xml:space="preserve"> (≤ 280)</w:t>
             </w:r>
           </w:p>
         </w:tc>
@@ -4191,7 +4173,7 @@
               <w:rPr>
                 <w:sz w:val="19"/>
               </w:rPr>
-              <w:t xml:space="preserve"> ($\le 280$)</w:t>
+              <w:t xml:space="preserve"> (≤ 280)</w:t>
             </w:r>
           </w:p>
         </w:tc>
@@ -4378,7 +4360,7 @@
               <w:rPr>
                 <w:sz w:val="19"/>
               </w:rPr>
-              <w:t xml:space="preserve"> ($\le 280$)</w:t>
+              <w:t xml:space="preserve"> (≤ 280)</w:t>
             </w:r>
           </w:p>
         </w:tc>
@@ -8388,7 +8370,7 @@
         <w:spacing w:before="20" w:after="40" w:line="276" w:lineRule="auto"/>
       </w:pPr>
       <w:r>
-        <w:t>Integrate with Hiver's shared inbox platform to route borderline-confidence predictions ($0.50 \le \text{confidence} &lt; 0.70$) to human customer service agents, streaming their edits back into a continuous retraining dataset.</w:t>
+        <w:t>Integrate with Hiver's shared inbox platform to route borderline-confidence predictions (0.50 ≤ confidence &lt; 0.70) to human customer service agents, streaming their edits back into a continuous retraining dataset.</w:t>
       </w:r>
     </w:p>
     <w:p>

</xml_diff>

<commit_message>
docs: clean Section 8 submission links with absolute GitHub URLs and remove broken google form
</commit_message>
<xml_diff>
--- a/reports/REPORT.docx
+++ b/reports/REPORT.docx
@@ -8407,15 +8407,7 @@
         <w:t>Primary Submission Email</w:t>
       </w:r>
       <w:r>
-        <w:t xml:space="preserve">: </w:t>
-      </w:r>
-      <w:r>
-        <w:rPr>
-          <w:rFonts w:ascii="Consolas" w:hAnsi="Consolas"/>
-          <w:color w:val="B42828"/>
-          <w:sz w:val="19"/>
-        </w:rPr>
-        <w:t>anurag@hiverhq.com</w:t>
+        <w:t>: anurag@hiverhq.com</w:t>
       </w:r>
     </w:p>
     <w:p>
@@ -8427,20 +8419,17 @@
         <w:rPr>
           <w:b/>
         </w:rPr>
-        <w:t>Candidate Repository</w:t>
-      </w:r>
-      <w:r>
-        <w:t>: [</w:t>
+        <w:t>Online Submission Form (Notion)</w:t>
+      </w:r>
+      <w:r>
+        <w:t xml:space="preserve">: </w:t>
       </w:r>
       <w:r>
         <w:rPr>
           <w:color w:val="1F4E79"/>
           <w:u w:val="single"/>
         </w:rPr>
-        <w:t>https://github.com/ro-lex404/Hiver-Assignment](https://github.com/ro-lex404/Hiver-Assignment</w:t>
-      </w:r>
-      <w:r>
-        <w:t>)</w:t>
+        <w:t>https://intelligent-bar-256.notion.site/39492cbf0da2800682cfc78a600a745f</w:t>
       </w:r>
     </w:p>
     <w:p>
@@ -8452,20 +8441,17 @@
         <w:rPr>
           <w:b/>
         </w:rPr>
-        <w:t>Interactive Form (Notion)</w:t>
-      </w:r>
-      <w:r>
-        <w:t>: [Hiver SDE Intern Take-Home Form](</w:t>
+        <w:t>GitHub Repository</w:t>
+      </w:r>
+      <w:r>
+        <w:t xml:space="preserve">: </w:t>
       </w:r>
       <w:r>
         <w:rPr>
           <w:color w:val="1F4E79"/>
           <w:u w:val="single"/>
         </w:rPr>
-        <w:t>https://intelligent-bar-256.notion.site/39492cbf0da2800682cfc78a600a745f</w:t>
-      </w:r>
-      <w:r>
-        <w:t>)</w:t>
+        <w:t>https://github.com/ro-lex404/Hiver-Assignment</w:t>
       </w:r>
     </w:p>
     <w:p>
@@ -8477,20 +8463,17 @@
         <w:rPr>
           <w:b/>
         </w:rPr>
-        <w:t>Interactive Form (Google)</w:t>
-      </w:r>
-      <w:r>
-        <w:t>: [</w:t>
+        <w:t>Full Evaluation Report</w:t>
+      </w:r>
+      <w:r>
+        <w:t xml:space="preserve">: </w:t>
       </w:r>
       <w:r>
         <w:rPr>
           <w:color w:val="1F4E79"/>
           <w:u w:val="single"/>
         </w:rPr>
-        <w:t>https://forms.gle/ZvK4mMnEtPVcSJ8H7](https://forms.gle/ZvK4mMnEtPVcSJ8H7</w:t>
-      </w:r>
-      <w:r>
-        <w:t>)</w:t>
+        <w:t>https://github.com/ro-lex404/Hiver-Assignment/blob/main/reports/REPORT.md</w:t>
       </w:r>
     </w:p>
     <w:p>
@@ -8505,18 +8488,14 @@
         <w:t>Engineering Decision Log</w:t>
       </w:r>
       <w:r>
-        <w:t>: [</w:t>
+        <w:t xml:space="preserve">: </w:t>
       </w:r>
       <w:r>
         <w:rPr>
-          <w:rFonts w:ascii="Consolas" w:hAnsi="Consolas"/>
-          <w:color w:val="B42828"/>
-          <w:sz w:val="19"/>
+          <w:color w:val="1F4E79"/>
+          <w:u w:val="single"/>
         </w:rPr>
-        <w:t>reports/DECISION_LOG.md</w:t>
-      </w:r>
-      <w:r>
-        <w:t>](DECISION_LOG.md)</w:t>
+        <w:t>https://github.com/ro-lex404/Hiver-Assignment/blob/main/reports/DECISION_LOG.md</w:t>
       </w:r>
     </w:p>
     <w:p>
@@ -8531,18 +8510,14 @@
         <w:t>Golden Evaluation Dataset</w:t>
       </w:r>
       <w:r>
-        <w:t>: [</w:t>
+        <w:t xml:space="preserve">: </w:t>
       </w:r>
       <w:r>
         <w:rPr>
-          <w:rFonts w:ascii="Consolas" w:hAnsi="Consolas"/>
-          <w:color w:val="B42828"/>
-          <w:sz w:val="19"/>
+          <w:color w:val="1F4E79"/>
+          <w:u w:val="single"/>
         </w:rPr>
-        <w:t>data/golden_set/golden_eval_200.jsonl</w:t>
-      </w:r>
-      <w:r>
-        <w:t>](../data/golden_set/golden_eval_200.jsonl)</w:t>
+        <w:t>https://github.com/ro-lex404/Hiver-Assignment/blob/main/data/golden_set/golden_eval_200.jsonl</w:t>
       </w:r>
     </w:p>
     <w:p>
@@ -8561,25 +8536,10 @@
       </w:r>
       <w:r>
         <w:rPr>
-          <w:rFonts w:ascii="Consolas" w:hAnsi="Consolas"/>
-          <w:color w:val="B42828"/>
-          <w:sz w:val="19"/>
+          <w:color w:val="1F4E79"/>
+          <w:u w:val="single"/>
         </w:rPr>
-        <w:t>notebooks/kaggle_gpu_support_pipeline.ipynb</w:t>
-      </w:r>
-      <w:r>
-        <w:t xml:space="preserve"> (</w:t>
-      </w:r>
-      <w:r>
-        <w:rPr>
-          <w:rFonts w:ascii="Consolas" w:hAnsi="Consolas"/>
-          <w:color w:val="B42828"/>
-          <w:sz w:val="19"/>
-        </w:rPr>
-        <w:t>rohanalexbimal/hiver-ai-support-agent</w:t>
-      </w:r>
-      <w:r>
-        <w:t>)</w:t>
+        <w:t>https://www.kaggle.com/code/rohanalexbimal/hiver-ai-support-agent</w:t>
       </w:r>
     </w:p>
     <w:sectPr>

</xml_diff>